<commit_message>
Found a better tutorial for Java swing to improve my understanding
</commit_message>
<xml_diff>
--- a/Java_Swing_tutorial/Java_Swing_Notes.docx
+++ b/Java_Swing_tutorial/Java_Swing_Notes.docx
@@ -118,7 +118,23 @@
           <w:b/>
           <w:bCs/>
         </w:rPr>
-        <w:t xml:space="preserve"> extends JFrame{</w:t>
+        <w:t xml:space="preserve"> extends </w:t>
+      </w:r>
+      <w:proofErr w:type="spellStart"/>
+      <w:r>
+        <w:rPr>
+          <w:b/>
+          <w:bCs/>
+        </w:rPr>
+        <w:t>JFrame</w:t>
+      </w:r>
+      <w:proofErr w:type="spellEnd"/>
+      <w:r>
+        <w:rPr>
+          <w:b/>
+          <w:bCs/>
+        </w:rPr>
+        <w:t>{</w:t>
       </w:r>
     </w:p>
     <w:p>
@@ -756,6 +772,2583 @@
         </w:rPr>
         <w:br/>
         <w:t>});</w:t>
+      </w:r>
+    </w:p>
+    <w:p>
+      <w:pPr>
+        <w:pStyle w:val="NoSpacing"/>
+      </w:pPr>
+    </w:p>
+    <w:p>
+      <w:pPr>
+        <w:pStyle w:val="NoSpacing"/>
+      </w:pPr>
+    </w:p>
+    <w:p>
+      <w:pPr>
+        <w:pStyle w:val="NoSpacing"/>
+      </w:pPr>
+    </w:p>
+    <w:p>
+      <w:pPr>
+        <w:pStyle w:val="NoSpacing"/>
+        <w:rPr>
+          <w:b/>
+          <w:bCs/>
+          <w:sz w:val="28"/>
+          <w:szCs w:val="28"/>
+          <w:u w:val="single"/>
+        </w:rPr>
+      </w:pPr>
+      <w:r>
+        <w:rPr>
+          <w:b/>
+          <w:bCs/>
+          <w:sz w:val="28"/>
+          <w:szCs w:val="28"/>
+          <w:u w:val="single"/>
+        </w:rPr>
+        <w:lastRenderedPageBreak/>
+        <w:t>Actual Notes to use:</w:t>
+      </w:r>
+    </w:p>
+    <w:p>
+      <w:pPr>
+        <w:pStyle w:val="NoSpacing"/>
+        <w:rPr>
+          <w:b/>
+          <w:bCs/>
+          <w:sz w:val="28"/>
+          <w:szCs w:val="28"/>
+          <w:u w:val="single"/>
+        </w:rPr>
+      </w:pPr>
+      <w:r>
+        <w:rPr>
+          <w:b/>
+          <w:bCs/>
+          <w:sz w:val="28"/>
+          <w:szCs w:val="28"/>
+          <w:u w:val="single"/>
+        </w:rPr>
+        <w:t xml:space="preserve">Creating a </w:t>
+      </w:r>
+      <w:proofErr w:type="spellStart"/>
+      <w:r>
+        <w:rPr>
+          <w:b/>
+          <w:bCs/>
+          <w:sz w:val="28"/>
+          <w:szCs w:val="28"/>
+          <w:u w:val="single"/>
+        </w:rPr>
+        <w:t>JFrame</w:t>
+      </w:r>
+      <w:proofErr w:type="spellEnd"/>
+    </w:p>
+    <w:p>
+      <w:pPr>
+        <w:pStyle w:val="NoSpacing"/>
+      </w:pPr>
+      <w:r>
+        <w:t xml:space="preserve">First create a Swing UI form by right clicking on </w:t>
+      </w:r>
+      <w:proofErr w:type="spellStart"/>
+      <w:r>
+        <w:t>src</w:t>
+      </w:r>
+      <w:proofErr w:type="spellEnd"/>
+      <w:r>
+        <w:t>.</w:t>
+      </w:r>
+    </w:p>
+    <w:p>
+      <w:pPr>
+        <w:pStyle w:val="NoSpacing"/>
+      </w:pPr>
+      <w:r>
+        <w:t xml:space="preserve">Then </w:t>
+      </w:r>
+      <w:r>
+        <w:rPr>
+          <w:b/>
+          <w:bCs/>
+        </w:rPr>
+        <w:t xml:space="preserve">import </w:t>
+      </w:r>
+      <w:proofErr w:type="spellStart"/>
+      <w:r>
+        <w:rPr>
+          <w:b/>
+          <w:bCs/>
+        </w:rPr>
+        <w:t>javax.swing.JFrame</w:t>
+      </w:r>
+      <w:proofErr w:type="spellEnd"/>
+    </w:p>
+    <w:p>
+      <w:pPr>
+        <w:pStyle w:val="NoSpacing"/>
+      </w:pPr>
+      <w:r>
+        <w:t xml:space="preserve">Then create a main class and in it instantiate a </w:t>
+      </w:r>
+      <w:proofErr w:type="spellStart"/>
+      <w:r>
+        <w:t>JFrame</w:t>
+      </w:r>
+      <w:proofErr w:type="spellEnd"/>
+      <w:r>
+        <w:t xml:space="preserve"> object by e.g. </w:t>
+      </w:r>
+    </w:p>
+    <w:p>
+      <w:pPr>
+        <w:pStyle w:val="NoSpacing"/>
+        <w:rPr>
+          <w:b/>
+          <w:bCs/>
+        </w:rPr>
+      </w:pPr>
+      <w:proofErr w:type="spellStart"/>
+      <w:r>
+        <w:rPr>
+          <w:b/>
+          <w:bCs/>
+        </w:rPr>
+        <w:t>JFrame</w:t>
+      </w:r>
+      <w:proofErr w:type="spellEnd"/>
+      <w:r>
+        <w:rPr>
+          <w:b/>
+          <w:bCs/>
+        </w:rPr>
+        <w:t xml:space="preserve"> frame = new </w:t>
+      </w:r>
+      <w:proofErr w:type="spellStart"/>
+      <w:r>
+        <w:rPr>
+          <w:b/>
+          <w:bCs/>
+        </w:rPr>
+        <w:t>JFrame</w:t>
+      </w:r>
+      <w:proofErr w:type="spellEnd"/>
+      <w:r>
+        <w:rPr>
+          <w:b/>
+          <w:bCs/>
+        </w:rPr>
+        <w:t>();</w:t>
+      </w:r>
+    </w:p>
+    <w:p>
+      <w:pPr>
+        <w:pStyle w:val="NoSpacing"/>
+        <w:rPr>
+          <w:b/>
+          <w:bCs/>
+        </w:rPr>
+      </w:pPr>
+      <w:r>
+        <w:t xml:space="preserve">Then set the frame to be visible using </w:t>
+      </w:r>
+      <w:proofErr w:type="spellStart"/>
+      <w:r>
+        <w:rPr>
+          <w:b/>
+          <w:bCs/>
+        </w:rPr>
+        <w:t>frame.setVisible</w:t>
+      </w:r>
+      <w:proofErr w:type="spellEnd"/>
+      <w:r>
+        <w:rPr>
+          <w:b/>
+          <w:bCs/>
+        </w:rPr>
+        <w:t>(true);</w:t>
+      </w:r>
+    </w:p>
+    <w:p>
+      <w:pPr>
+        <w:pStyle w:val="NoSpacing"/>
+        <w:rPr>
+          <w:b/>
+          <w:bCs/>
+        </w:rPr>
+      </w:pPr>
+      <w:r>
+        <w:t xml:space="preserve">Then set the size of the frame using </w:t>
+      </w:r>
+      <w:proofErr w:type="spellStart"/>
+      <w:r>
+        <w:rPr>
+          <w:b/>
+          <w:bCs/>
+        </w:rPr>
+        <w:t>frame.setSize</w:t>
+      </w:r>
+      <w:proofErr w:type="spellEnd"/>
+      <w:r>
+        <w:rPr>
+          <w:b/>
+          <w:bCs/>
+        </w:rPr>
+        <w:t>(width, height);</w:t>
+      </w:r>
+    </w:p>
+    <w:p>
+      <w:pPr>
+        <w:pStyle w:val="NoSpacing"/>
+        <w:rPr>
+          <w:b/>
+          <w:bCs/>
+        </w:rPr>
+      </w:pPr>
+      <w:r>
+        <w:t xml:space="preserve">Then set the title of the frame using </w:t>
+      </w:r>
+      <w:proofErr w:type="spellStart"/>
+      <w:r>
+        <w:rPr>
+          <w:b/>
+          <w:bCs/>
+        </w:rPr>
+        <w:t>frame.setTitle</w:t>
+      </w:r>
+      <w:proofErr w:type="spellEnd"/>
+      <w:r>
+        <w:rPr>
+          <w:b/>
+          <w:bCs/>
+        </w:rPr>
+        <w:t>(</w:t>
+      </w:r>
+      <w:proofErr w:type="spellStart"/>
+      <w:r>
+        <w:rPr>
+          <w:b/>
+          <w:bCs/>
+        </w:rPr>
+        <w:t>TitleName</w:t>
+      </w:r>
+      <w:proofErr w:type="spellEnd"/>
+      <w:r>
+        <w:rPr>
+          <w:b/>
+          <w:bCs/>
+        </w:rPr>
+        <w:t>);</w:t>
+      </w:r>
+    </w:p>
+    <w:p>
+      <w:pPr>
+        <w:pStyle w:val="NoSpacing"/>
+        <w:rPr>
+          <w:b/>
+          <w:bCs/>
+        </w:rPr>
+      </w:pPr>
+      <w:r>
+        <w:t xml:space="preserve">To make the program close when you exit from it, you use </w:t>
+      </w:r>
+      <w:proofErr w:type="spellStart"/>
+      <w:r>
+        <w:rPr>
+          <w:b/>
+          <w:bCs/>
+        </w:rPr>
+        <w:t>frame.setDefaultCloseOperation</w:t>
+      </w:r>
+      <w:proofErr w:type="spellEnd"/>
+      <w:r>
+        <w:rPr>
+          <w:b/>
+          <w:bCs/>
+        </w:rPr>
+        <w:t>(</w:t>
+      </w:r>
+      <w:proofErr w:type="spellStart"/>
+      <w:r>
+        <w:rPr>
+          <w:b/>
+          <w:bCs/>
+        </w:rPr>
+        <w:t>JFrame.EXIT_ON_CLOSE</w:t>
+      </w:r>
+      <w:proofErr w:type="spellEnd"/>
+      <w:r>
+        <w:rPr>
+          <w:b/>
+          <w:bCs/>
+        </w:rPr>
+        <w:t>)</w:t>
+      </w:r>
+      <w:r>
+        <w:rPr>
+          <w:b/>
+          <w:bCs/>
+        </w:rPr>
+        <w:t>;</w:t>
+      </w:r>
+    </w:p>
+    <w:p>
+      <w:pPr>
+        <w:pStyle w:val="NoSpacing"/>
+      </w:pPr>
+      <w:r>
+        <w:t xml:space="preserve">To make a frame be not resizable, you use </w:t>
+      </w:r>
+      <w:proofErr w:type="spellStart"/>
+      <w:r>
+        <w:rPr>
+          <w:b/>
+          <w:bCs/>
+        </w:rPr>
+        <w:t>frame.setResizable</w:t>
+      </w:r>
+      <w:proofErr w:type="spellEnd"/>
+      <w:r>
+        <w:rPr>
+          <w:b/>
+          <w:bCs/>
+        </w:rPr>
+        <w:t>(false);</w:t>
+      </w:r>
+    </w:p>
+    <w:p>
+      <w:pPr>
+        <w:pStyle w:val="NoSpacing"/>
+        <w:rPr>
+          <w:b/>
+          <w:bCs/>
+        </w:rPr>
+      </w:pPr>
+      <w:r>
+        <w:t xml:space="preserve">To change the icon in the top of the program, you use </w:t>
+      </w:r>
+      <w:proofErr w:type="spellStart"/>
+      <w:r>
+        <w:rPr>
+          <w:b/>
+          <w:bCs/>
+        </w:rPr>
+        <w:t>ImageIcon</w:t>
+      </w:r>
+      <w:proofErr w:type="spellEnd"/>
+      <w:r>
+        <w:rPr>
+          <w:b/>
+          <w:bCs/>
+        </w:rPr>
+        <w:t xml:space="preserve"> image = new </w:t>
+      </w:r>
+      <w:proofErr w:type="spellStart"/>
+      <w:r>
+        <w:rPr>
+          <w:b/>
+          <w:bCs/>
+        </w:rPr>
+        <w:t>ImageIcon</w:t>
+      </w:r>
+      <w:proofErr w:type="spellEnd"/>
+      <w:r>
+        <w:rPr>
+          <w:b/>
+          <w:bCs/>
+        </w:rPr>
+        <w:t>(“</w:t>
+      </w:r>
+      <w:proofErr w:type="spellStart"/>
+      <w:r>
+        <w:rPr>
+          <w:b/>
+          <w:bCs/>
+        </w:rPr>
+        <w:t>fileName</w:t>
+      </w:r>
+      <w:proofErr w:type="spellEnd"/>
+      <w:r>
+        <w:rPr>
+          <w:b/>
+          <w:bCs/>
+        </w:rPr>
+        <w:t>”)</w:t>
+      </w:r>
+      <w:r>
+        <w:rPr>
+          <w:b/>
+          <w:bCs/>
+        </w:rPr>
+        <w:t xml:space="preserve"> </w:t>
+      </w:r>
+      <w:r>
+        <w:t xml:space="preserve">and </w:t>
+      </w:r>
+      <w:r>
+        <w:rPr>
+          <w:b/>
+          <w:bCs/>
+        </w:rPr>
+        <w:t xml:space="preserve">import </w:t>
+      </w:r>
+      <w:proofErr w:type="spellStart"/>
+      <w:r>
+        <w:rPr>
+          <w:b/>
+          <w:bCs/>
+        </w:rPr>
+        <w:t>javax.swing.ImageIcon</w:t>
+      </w:r>
+      <w:proofErr w:type="spellEnd"/>
+      <w:r>
+        <w:rPr>
+          <w:b/>
+          <w:bCs/>
+        </w:rPr>
+        <w:t>;</w:t>
+      </w:r>
+    </w:p>
+    <w:p>
+      <w:pPr>
+        <w:pStyle w:val="NoSpacing"/>
+        <w:rPr>
+          <w:b/>
+          <w:bCs/>
+        </w:rPr>
+      </w:pPr>
+      <w:r>
+        <w:t xml:space="preserve">Then use </w:t>
+      </w:r>
+      <w:proofErr w:type="spellStart"/>
+      <w:r>
+        <w:rPr>
+          <w:b/>
+          <w:bCs/>
+        </w:rPr>
+        <w:t>frame.setIconImage</w:t>
+      </w:r>
+      <w:proofErr w:type="spellEnd"/>
+      <w:r>
+        <w:rPr>
+          <w:b/>
+          <w:bCs/>
+        </w:rPr>
+        <w:t>(</w:t>
+      </w:r>
+      <w:proofErr w:type="spellStart"/>
+      <w:r>
+        <w:rPr>
+          <w:b/>
+          <w:bCs/>
+        </w:rPr>
+        <w:t>image.getImage</w:t>
+      </w:r>
+      <w:proofErr w:type="spellEnd"/>
+      <w:r>
+        <w:rPr>
+          <w:b/>
+          <w:bCs/>
+        </w:rPr>
+        <w:t>());</w:t>
+      </w:r>
+    </w:p>
+    <w:p>
+      <w:pPr>
+        <w:pStyle w:val="NoSpacing"/>
+        <w:rPr>
+          <w:b/>
+          <w:bCs/>
+        </w:rPr>
+      </w:pPr>
+      <w:r>
+        <w:t xml:space="preserve">To set the background colour, you use </w:t>
+      </w:r>
+      <w:proofErr w:type="spellStart"/>
+      <w:r>
+        <w:rPr>
+          <w:b/>
+          <w:bCs/>
+        </w:rPr>
+        <w:t>frame.getContentPane</w:t>
+      </w:r>
+      <w:proofErr w:type="spellEnd"/>
+      <w:r>
+        <w:rPr>
+          <w:b/>
+          <w:bCs/>
+        </w:rPr>
+        <w:t>().</w:t>
+      </w:r>
+      <w:proofErr w:type="spellStart"/>
+      <w:r>
+        <w:rPr>
+          <w:b/>
+          <w:bCs/>
+        </w:rPr>
+        <w:t>setBackground</w:t>
+      </w:r>
+      <w:proofErr w:type="spellEnd"/>
+      <w:r>
+        <w:rPr>
+          <w:b/>
+          <w:bCs/>
+        </w:rPr>
+        <w:t>(</w:t>
+      </w:r>
+      <w:proofErr w:type="spellStart"/>
+      <w:r>
+        <w:rPr>
+          <w:b/>
+          <w:bCs/>
+        </w:rPr>
+        <w:t>Color.</w:t>
+      </w:r>
+      <w:r>
+        <w:rPr>
+          <w:b/>
+          <w:bCs/>
+          <w:i/>
+          <w:iCs/>
+        </w:rPr>
+        <w:t>green</w:t>
+      </w:r>
+      <w:proofErr w:type="spellEnd"/>
+      <w:r>
+        <w:rPr>
+          <w:b/>
+          <w:bCs/>
+        </w:rPr>
+        <w:t>);</w:t>
+      </w:r>
+      <w:r>
+        <w:rPr>
+          <w:b/>
+          <w:bCs/>
+        </w:rPr>
+        <w:t xml:space="preserve"> </w:t>
+      </w:r>
+      <w:r>
+        <w:t>and</w:t>
+      </w:r>
+      <w:r>
+        <w:rPr>
+          <w:b/>
+          <w:bCs/>
+        </w:rPr>
+        <w:t xml:space="preserve"> import </w:t>
+      </w:r>
+      <w:proofErr w:type="spellStart"/>
+      <w:r>
+        <w:rPr>
+          <w:b/>
+          <w:bCs/>
+        </w:rPr>
+        <w:t>java.awt.Color</w:t>
+      </w:r>
+      <w:proofErr w:type="spellEnd"/>
+      <w:r>
+        <w:rPr>
+          <w:b/>
+          <w:bCs/>
+        </w:rPr>
+        <w:t>;</w:t>
+      </w:r>
+    </w:p>
+    <w:p>
+      <w:pPr>
+        <w:pStyle w:val="NoSpacing"/>
+      </w:pPr>
+      <w:r>
+        <w:t>Or use “</w:t>
+      </w:r>
+      <w:r>
+        <w:rPr>
+          <w:b/>
+          <w:bCs/>
+        </w:rPr>
+        <w:t xml:space="preserve">new </w:t>
+      </w:r>
+      <w:proofErr w:type="spellStart"/>
+      <w:r>
+        <w:rPr>
+          <w:b/>
+          <w:bCs/>
+        </w:rPr>
+        <w:t>Color</w:t>
+      </w:r>
+      <w:proofErr w:type="spellEnd"/>
+      <w:r>
+        <w:rPr>
+          <w:b/>
+          <w:bCs/>
+        </w:rPr>
+        <w:t>(255,255,255)</w:t>
+      </w:r>
+      <w:r>
+        <w:t xml:space="preserve">” for </w:t>
+      </w:r>
+      <w:proofErr w:type="spellStart"/>
+      <w:r>
+        <w:t>rgb</w:t>
+      </w:r>
+      <w:proofErr w:type="spellEnd"/>
+      <w:r>
+        <w:t xml:space="preserve"> </w:t>
+      </w:r>
+      <w:proofErr w:type="spellStart"/>
+      <w:r>
+        <w:t>colors</w:t>
+      </w:r>
+      <w:proofErr w:type="spellEnd"/>
+      <w:r>
+        <w:t>, or “</w:t>
+      </w:r>
+      <w:r>
+        <w:rPr>
+          <w:b/>
+          <w:bCs/>
+        </w:rPr>
+        <w:t xml:space="preserve">new </w:t>
+      </w:r>
+      <w:proofErr w:type="spellStart"/>
+      <w:r>
+        <w:rPr>
+          <w:b/>
+          <w:bCs/>
+        </w:rPr>
+        <w:t>Color</w:t>
+      </w:r>
+      <w:proofErr w:type="spellEnd"/>
+      <w:r>
+        <w:rPr>
+          <w:b/>
+          <w:bCs/>
+        </w:rPr>
+        <w:t>(0xFFFFFF)</w:t>
+      </w:r>
+      <w:r>
+        <w:t>”</w:t>
+      </w:r>
+      <w:r>
+        <w:t xml:space="preserve"> for Hex values.</w:t>
+      </w:r>
+    </w:p>
+    <w:p>
+      <w:pPr>
+        <w:pStyle w:val="NoSpacing"/>
+      </w:pPr>
+    </w:p>
+    <w:p>
+      <w:pPr>
+        <w:pStyle w:val="NoSpacing"/>
+      </w:pPr>
+    </w:p>
+    <w:p>
+      <w:pPr>
+        <w:pStyle w:val="NoSpacing"/>
+      </w:pPr>
+      <w:r>
+        <w:t xml:space="preserve">You can also make a child class by inheriting from </w:t>
+      </w:r>
+      <w:proofErr w:type="spellStart"/>
+      <w:r>
+        <w:t>JFrame</w:t>
+      </w:r>
+      <w:proofErr w:type="spellEnd"/>
+      <w:r>
+        <w:t xml:space="preserve">, </w:t>
+      </w:r>
+      <w:proofErr w:type="spellStart"/>
+      <w:r>
+        <w:t>e.g</w:t>
+      </w:r>
+      <w:proofErr w:type="spellEnd"/>
+      <w:r>
+        <w:t>:</w:t>
+      </w:r>
+    </w:p>
+    <w:p>
+      <w:pPr>
+        <w:pStyle w:val="NoSpacing"/>
+        <w:rPr>
+          <w:b/>
+          <w:bCs/>
+        </w:rPr>
+      </w:pPr>
+      <w:r>
+        <w:rPr>
+          <w:b/>
+          <w:bCs/>
+        </w:rPr>
+        <w:t xml:space="preserve">public class Frame extends </w:t>
+      </w:r>
+      <w:proofErr w:type="spellStart"/>
+      <w:r>
+        <w:rPr>
+          <w:b/>
+          <w:bCs/>
+        </w:rPr>
+        <w:t>JFrame</w:t>
+      </w:r>
+      <w:proofErr w:type="spellEnd"/>
+      <w:r>
+        <w:rPr>
+          <w:b/>
+          <w:bCs/>
+        </w:rPr>
+        <w:t>{</w:t>
+      </w:r>
+      <w:r>
+        <w:rPr>
+          <w:b/>
+          <w:bCs/>
+        </w:rPr>
+        <w:br/>
+        <w:t>}</w:t>
+      </w:r>
+    </w:p>
+    <w:p>
+      <w:pPr>
+        <w:pStyle w:val="NoSpacing"/>
+      </w:pPr>
+      <w:r>
+        <w:t xml:space="preserve">and then using </w:t>
+      </w:r>
+      <w:r>
+        <w:t>“</w:t>
+      </w:r>
+      <w:r>
+        <w:t>this.</w:t>
+      </w:r>
+      <w:r>
+        <w:t>”</w:t>
+      </w:r>
+      <w:r>
+        <w:t xml:space="preserve"> For </w:t>
+      </w:r>
+      <w:r>
+        <w:t>all</w:t>
+      </w:r>
+      <w:r>
+        <w:t xml:space="preserve"> the methods and attributes which </w:t>
+      </w:r>
+      <w:r>
+        <w:t>you put in the constructor.</w:t>
+      </w:r>
+    </w:p>
+    <w:p>
+      <w:pPr>
+        <w:pStyle w:val="NoSpacing"/>
+      </w:pPr>
+    </w:p>
+    <w:p>
+      <w:pPr>
+        <w:pStyle w:val="NoSpacing"/>
+        <w:rPr>
+          <w:b/>
+          <w:bCs/>
+          <w:sz w:val="32"/>
+          <w:szCs w:val="32"/>
+          <w:u w:val="single"/>
+        </w:rPr>
+      </w:pPr>
+      <w:r>
+        <w:rPr>
+          <w:b/>
+          <w:bCs/>
+          <w:sz w:val="32"/>
+          <w:szCs w:val="32"/>
+          <w:u w:val="single"/>
+        </w:rPr>
+        <w:t>Labels</w:t>
+      </w:r>
+    </w:p>
+    <w:p>
+      <w:pPr>
+        <w:pStyle w:val="NoSpacing"/>
+        <w:rPr>
+          <w:b/>
+          <w:bCs/>
+        </w:rPr>
+      </w:pPr>
+      <w:r>
+        <w:t xml:space="preserve">To create a label (a display area for text, image or both), you write </w:t>
+      </w:r>
+      <w:proofErr w:type="spellStart"/>
+      <w:r>
+        <w:rPr>
+          <w:b/>
+          <w:bCs/>
+        </w:rPr>
+        <w:t>JLabel</w:t>
+      </w:r>
+      <w:proofErr w:type="spellEnd"/>
+      <w:r>
+        <w:rPr>
+          <w:b/>
+          <w:bCs/>
+        </w:rPr>
+        <w:t xml:space="preserve"> label = new </w:t>
+      </w:r>
+      <w:proofErr w:type="spellStart"/>
+      <w:r>
+        <w:rPr>
+          <w:b/>
+          <w:bCs/>
+        </w:rPr>
+        <w:t>Jlabel</w:t>
+      </w:r>
+      <w:proofErr w:type="spellEnd"/>
+      <w:r>
+        <w:rPr>
+          <w:b/>
+          <w:bCs/>
+        </w:rPr>
+        <w:t>();</w:t>
+      </w:r>
+      <w:r>
+        <w:rPr>
+          <w:b/>
+          <w:bCs/>
+        </w:rPr>
+        <w:t xml:space="preserve"> </w:t>
+      </w:r>
+      <w:r>
+        <w:t xml:space="preserve">and </w:t>
+      </w:r>
+      <w:r>
+        <w:rPr>
+          <w:b/>
+          <w:bCs/>
+        </w:rPr>
+        <w:t xml:space="preserve">import </w:t>
+      </w:r>
+      <w:proofErr w:type="spellStart"/>
+      <w:r>
+        <w:rPr>
+          <w:b/>
+          <w:bCs/>
+        </w:rPr>
+        <w:t>javax.swing.JLabel</w:t>
+      </w:r>
+      <w:proofErr w:type="spellEnd"/>
+      <w:r>
+        <w:rPr>
+          <w:b/>
+          <w:bCs/>
+        </w:rPr>
+        <w:t>;</w:t>
+      </w:r>
+    </w:p>
+    <w:p>
+      <w:pPr>
+        <w:pStyle w:val="NoSpacing"/>
+        <w:rPr>
+          <w:b/>
+          <w:bCs/>
+        </w:rPr>
+      </w:pPr>
+      <w:r>
+        <w:t xml:space="preserve">To set the text of the label, you use </w:t>
+      </w:r>
+      <w:proofErr w:type="spellStart"/>
+      <w:r>
+        <w:rPr>
+          <w:b/>
+          <w:bCs/>
+        </w:rPr>
+        <w:t>label.setText</w:t>
+      </w:r>
+      <w:proofErr w:type="spellEnd"/>
+      <w:r>
+        <w:rPr>
+          <w:b/>
+          <w:bCs/>
+        </w:rPr>
+        <w:t>("This is a string for my label");</w:t>
+      </w:r>
+    </w:p>
+    <w:p>
+      <w:pPr>
+        <w:pStyle w:val="NoSpacing"/>
+      </w:pPr>
+      <w:r>
+        <w:t xml:space="preserve">To then add this label to the </w:t>
+      </w:r>
+      <w:proofErr w:type="spellStart"/>
+      <w:r>
+        <w:t>JFrame</w:t>
+      </w:r>
+      <w:proofErr w:type="spellEnd"/>
+      <w:r>
+        <w:t xml:space="preserve">, you use </w:t>
+      </w:r>
+      <w:proofErr w:type="spellStart"/>
+      <w:r>
+        <w:rPr>
+          <w:b/>
+          <w:bCs/>
+        </w:rPr>
+        <w:t>frame.add</w:t>
+      </w:r>
+      <w:proofErr w:type="spellEnd"/>
+      <w:r>
+        <w:rPr>
+          <w:b/>
+          <w:bCs/>
+        </w:rPr>
+        <w:t>(label);</w:t>
+      </w:r>
+    </w:p>
+    <w:p>
+      <w:pPr>
+        <w:pStyle w:val="NoSpacing"/>
+        <w:rPr>
+          <w:b/>
+          <w:bCs/>
+        </w:rPr>
+      </w:pPr>
+      <w:r>
+        <w:t xml:space="preserve">To then update the frame’s layout and then redraw it, you use </w:t>
+      </w:r>
+      <w:proofErr w:type="spellStart"/>
+      <w:r>
+        <w:rPr>
+          <w:b/>
+          <w:bCs/>
+        </w:rPr>
+        <w:t>frame.revalidate</w:t>
+      </w:r>
+      <w:proofErr w:type="spellEnd"/>
+      <w:r>
+        <w:rPr>
+          <w:b/>
+          <w:bCs/>
+        </w:rPr>
+        <w:t xml:space="preserve">(); </w:t>
+      </w:r>
+      <w:r>
+        <w:t xml:space="preserve">followed by </w:t>
+      </w:r>
+      <w:proofErr w:type="spellStart"/>
+      <w:r>
+        <w:rPr>
+          <w:b/>
+          <w:bCs/>
+        </w:rPr>
+        <w:t>frame.repaint</w:t>
+      </w:r>
+      <w:proofErr w:type="spellEnd"/>
+      <w:r>
+        <w:rPr>
+          <w:b/>
+          <w:bCs/>
+        </w:rPr>
+        <w:t>();</w:t>
+      </w:r>
+    </w:p>
+    <w:p>
+      <w:pPr>
+        <w:pStyle w:val="NoSpacing"/>
+        <w:rPr>
+          <w:b/>
+          <w:bCs/>
+        </w:rPr>
+      </w:pPr>
+      <w:r>
+        <w:t xml:space="preserve">To set the image icon of the label, you create an image icon like before (making sure the image is not in the </w:t>
+      </w:r>
+      <w:proofErr w:type="spellStart"/>
+      <w:r>
+        <w:t>src</w:t>
+      </w:r>
+      <w:proofErr w:type="spellEnd"/>
+      <w:r>
+        <w:t xml:space="preserve"> folder), and then you use </w:t>
+      </w:r>
+      <w:proofErr w:type="spellStart"/>
+      <w:r>
+        <w:rPr>
+          <w:b/>
+          <w:bCs/>
+        </w:rPr>
+        <w:t>label.setIcon</w:t>
+      </w:r>
+      <w:proofErr w:type="spellEnd"/>
+      <w:r>
+        <w:rPr>
+          <w:b/>
+          <w:bCs/>
+        </w:rPr>
+        <w:t>(image);</w:t>
+      </w:r>
+    </w:p>
+    <w:p>
+      <w:pPr>
+        <w:pStyle w:val="NoSpacing"/>
+      </w:pPr>
+      <w:r>
+        <w:t xml:space="preserve">To then move the string of text relative to the image, you can use </w:t>
+      </w:r>
+      <w:proofErr w:type="spellStart"/>
+      <w:r>
+        <w:rPr>
+          <w:b/>
+          <w:bCs/>
+        </w:rPr>
+        <w:t>label.setHorizontalTextPosition</w:t>
+      </w:r>
+      <w:proofErr w:type="spellEnd"/>
+      <w:r>
+        <w:rPr>
+          <w:b/>
+          <w:bCs/>
+        </w:rPr>
+        <w:t>(</w:t>
+      </w:r>
+      <w:proofErr w:type="spellStart"/>
+      <w:r>
+        <w:rPr>
+          <w:b/>
+          <w:bCs/>
+        </w:rPr>
+        <w:t>JLabel.</w:t>
+      </w:r>
+      <w:r>
+        <w:rPr>
+          <w:b/>
+          <w:bCs/>
+          <w:i/>
+          <w:iCs/>
+        </w:rPr>
+        <w:t>CENTER</w:t>
+      </w:r>
+      <w:proofErr w:type="spellEnd"/>
+      <w:r>
+        <w:rPr>
+          <w:b/>
+          <w:bCs/>
+        </w:rPr>
+        <w:t>);</w:t>
+      </w:r>
+      <w:r>
+        <w:t xml:space="preserve"> and </w:t>
+      </w:r>
+      <w:proofErr w:type="spellStart"/>
+      <w:r>
+        <w:rPr>
+          <w:b/>
+          <w:bCs/>
+        </w:rPr>
+        <w:t>label.setVerticalTextPosition</w:t>
+      </w:r>
+      <w:proofErr w:type="spellEnd"/>
+      <w:r>
+        <w:rPr>
+          <w:b/>
+          <w:bCs/>
+        </w:rPr>
+        <w:t>(</w:t>
+      </w:r>
+      <w:proofErr w:type="spellStart"/>
+      <w:r>
+        <w:rPr>
+          <w:b/>
+          <w:bCs/>
+        </w:rPr>
+        <w:t>JLabel.</w:t>
+      </w:r>
+      <w:r>
+        <w:rPr>
+          <w:b/>
+          <w:bCs/>
+          <w:i/>
+          <w:iCs/>
+        </w:rPr>
+        <w:t>BOTTOM</w:t>
+      </w:r>
+      <w:proofErr w:type="spellEnd"/>
+      <w:r>
+        <w:rPr>
+          <w:b/>
+          <w:bCs/>
+        </w:rPr>
+        <w:t>);</w:t>
+      </w:r>
+    </w:p>
+    <w:p>
+      <w:pPr>
+        <w:pStyle w:val="NoSpacing"/>
+      </w:pPr>
+      <w:r>
+        <w:t xml:space="preserve">To change the font colour, you use </w:t>
+      </w:r>
+      <w:proofErr w:type="spellStart"/>
+      <w:r>
+        <w:rPr>
+          <w:b/>
+          <w:bCs/>
+        </w:rPr>
+        <w:t>label.setForeground</w:t>
+      </w:r>
+      <w:proofErr w:type="spellEnd"/>
+      <w:r>
+        <w:rPr>
+          <w:b/>
+          <w:bCs/>
+        </w:rPr>
+        <w:t xml:space="preserve">(new </w:t>
+      </w:r>
+      <w:proofErr w:type="spellStart"/>
+      <w:r>
+        <w:rPr>
+          <w:b/>
+          <w:bCs/>
+        </w:rPr>
+        <w:t>Color</w:t>
+      </w:r>
+      <w:proofErr w:type="spellEnd"/>
+      <w:r>
+        <w:rPr>
+          <w:b/>
+          <w:bCs/>
+        </w:rPr>
+        <w:t>(255,255,255))</w:t>
+      </w:r>
+      <w:r>
+        <w:rPr>
+          <w:b/>
+          <w:bCs/>
+        </w:rPr>
+        <w:t>;</w:t>
+      </w:r>
+    </w:p>
+    <w:p>
+      <w:pPr>
+        <w:pStyle w:val="NoSpacing"/>
+        <w:rPr>
+          <w:b/>
+          <w:bCs/>
+        </w:rPr>
+      </w:pPr>
+      <w:r>
+        <w:t xml:space="preserve">To change the font styling, you use </w:t>
+      </w:r>
+      <w:proofErr w:type="spellStart"/>
+      <w:r>
+        <w:rPr>
+          <w:b/>
+          <w:bCs/>
+        </w:rPr>
+        <w:t>label.setFont</w:t>
+      </w:r>
+      <w:proofErr w:type="spellEnd"/>
+      <w:r>
+        <w:rPr>
+          <w:b/>
+          <w:bCs/>
+        </w:rPr>
+        <w:t xml:space="preserve">(new Font(“MV Boli”, </w:t>
+      </w:r>
+      <w:proofErr w:type="spellStart"/>
+      <w:r>
+        <w:rPr>
+          <w:b/>
+          <w:bCs/>
+        </w:rPr>
+        <w:t>Font.PLAIN</w:t>
+      </w:r>
+      <w:proofErr w:type="spellEnd"/>
+      <w:r>
+        <w:rPr>
+          <w:b/>
+          <w:bCs/>
+        </w:rPr>
+        <w:t>, 20));</w:t>
+      </w:r>
+      <w:r>
+        <w:rPr>
+          <w:b/>
+          <w:bCs/>
+        </w:rPr>
+        <w:t xml:space="preserve"> </w:t>
+      </w:r>
+      <w:r>
+        <w:t xml:space="preserve">and </w:t>
+      </w:r>
+      <w:r>
+        <w:rPr>
+          <w:b/>
+          <w:bCs/>
+        </w:rPr>
+        <w:t xml:space="preserve">import </w:t>
+      </w:r>
+      <w:proofErr w:type="spellStart"/>
+      <w:r>
+        <w:rPr>
+          <w:b/>
+          <w:bCs/>
+        </w:rPr>
+        <w:t>java.awt.Font</w:t>
+      </w:r>
+      <w:proofErr w:type="spellEnd"/>
+      <w:r>
+        <w:rPr>
+          <w:b/>
+          <w:bCs/>
+        </w:rPr>
+        <w:t>;</w:t>
+      </w:r>
+    </w:p>
+    <w:p>
+      <w:pPr>
+        <w:pStyle w:val="NoSpacing"/>
+        <w:rPr>
+          <w:b/>
+          <w:bCs/>
+        </w:rPr>
+      </w:pPr>
+      <w:r>
+        <w:t xml:space="preserve">To change the gap between text and the image icon, you can use </w:t>
+      </w:r>
+      <w:proofErr w:type="spellStart"/>
+      <w:r>
+        <w:rPr>
+          <w:b/>
+          <w:bCs/>
+        </w:rPr>
+        <w:t>label.setIconTextGap</w:t>
+      </w:r>
+      <w:proofErr w:type="spellEnd"/>
+      <w:r>
+        <w:rPr>
+          <w:b/>
+          <w:bCs/>
+        </w:rPr>
+        <w:t>(30);</w:t>
+      </w:r>
+    </w:p>
+    <w:p>
+      <w:pPr>
+        <w:pStyle w:val="NoSpacing"/>
+      </w:pPr>
+      <w:r>
+        <w:t xml:space="preserve">To set the opacity of the label, you use </w:t>
+      </w:r>
+      <w:proofErr w:type="spellStart"/>
+      <w:r>
+        <w:rPr>
+          <w:b/>
+          <w:bCs/>
+        </w:rPr>
+        <w:t>label.setOpaque</w:t>
+      </w:r>
+      <w:proofErr w:type="spellEnd"/>
+      <w:r>
+        <w:rPr>
+          <w:b/>
+          <w:bCs/>
+        </w:rPr>
+        <w:t>(</w:t>
+      </w:r>
+      <w:r>
+        <w:rPr>
+          <w:b/>
+          <w:bCs/>
+        </w:rPr>
+        <w:t>true</w:t>
+      </w:r>
+      <w:r>
+        <w:rPr>
+          <w:b/>
+          <w:bCs/>
+        </w:rPr>
+        <w:t>);</w:t>
+      </w:r>
+    </w:p>
+    <w:p>
+      <w:pPr>
+        <w:pStyle w:val="NoSpacing"/>
+      </w:pPr>
+      <w:r>
+        <w:lastRenderedPageBreak/>
+        <w:t xml:space="preserve">To set the background </w:t>
+      </w:r>
+      <w:proofErr w:type="spellStart"/>
+      <w:r>
+        <w:t>color</w:t>
+      </w:r>
+      <w:proofErr w:type="spellEnd"/>
+      <w:r>
+        <w:t xml:space="preserve"> or the label, you use </w:t>
+      </w:r>
+      <w:proofErr w:type="spellStart"/>
+      <w:r>
+        <w:rPr>
+          <w:b/>
+          <w:bCs/>
+        </w:rPr>
+        <w:t>label.setBackground</w:t>
+      </w:r>
+      <w:proofErr w:type="spellEnd"/>
+      <w:r>
+        <w:rPr>
+          <w:b/>
+          <w:bCs/>
+        </w:rPr>
+        <w:t>(</w:t>
+      </w:r>
+      <w:proofErr w:type="spellStart"/>
+      <w:r>
+        <w:rPr>
+          <w:b/>
+          <w:bCs/>
+        </w:rPr>
+        <w:t>Color.black</w:t>
+      </w:r>
+      <w:proofErr w:type="spellEnd"/>
+      <w:r>
+        <w:rPr>
+          <w:b/>
+          <w:bCs/>
+        </w:rPr>
+        <w:t>);</w:t>
+      </w:r>
+      <w:r>
+        <w:rPr>
+          <w:b/>
+          <w:bCs/>
+        </w:rPr>
+        <w:t xml:space="preserve"> </w:t>
+      </w:r>
+      <w:r>
+        <w:t>and opaque must be set to true to see it.</w:t>
+      </w:r>
+    </w:p>
+    <w:p>
+      <w:pPr>
+        <w:pStyle w:val="NoSpacing"/>
+        <w:rPr>
+          <w:b/>
+          <w:bCs/>
+        </w:rPr>
+      </w:pPr>
+      <w:r>
+        <w:t xml:space="preserve">To create a border, you use </w:t>
+      </w:r>
+      <w:r>
+        <w:rPr>
+          <w:b/>
+          <w:bCs/>
+        </w:rPr>
+        <w:t xml:space="preserve">Border </w:t>
+      </w:r>
+      <w:proofErr w:type="spellStart"/>
+      <w:r>
+        <w:rPr>
+          <w:b/>
+          <w:bCs/>
+        </w:rPr>
+        <w:t>border</w:t>
+      </w:r>
+      <w:proofErr w:type="spellEnd"/>
+      <w:r>
+        <w:rPr>
+          <w:b/>
+          <w:bCs/>
+        </w:rPr>
+        <w:t xml:space="preserve"> = </w:t>
+      </w:r>
+      <w:proofErr w:type="spellStart"/>
+      <w:r>
+        <w:rPr>
+          <w:b/>
+          <w:bCs/>
+        </w:rPr>
+        <w:t>BorderFactory.</w:t>
+      </w:r>
+      <w:r>
+        <w:rPr>
+          <w:b/>
+          <w:bCs/>
+          <w:i/>
+          <w:iCs/>
+        </w:rPr>
+        <w:t>createLineBorder</w:t>
+      </w:r>
+      <w:proofErr w:type="spellEnd"/>
+      <w:r>
+        <w:rPr>
+          <w:b/>
+          <w:bCs/>
+        </w:rPr>
+        <w:t>(</w:t>
+      </w:r>
+      <w:proofErr w:type="spellStart"/>
+      <w:r>
+        <w:rPr>
+          <w:b/>
+          <w:bCs/>
+        </w:rPr>
+        <w:t>Color.</w:t>
+      </w:r>
+      <w:r>
+        <w:rPr>
+          <w:b/>
+          <w:bCs/>
+          <w:i/>
+          <w:iCs/>
+        </w:rPr>
+        <w:t>GREEN</w:t>
+      </w:r>
+      <w:proofErr w:type="spellEnd"/>
+      <w:r>
+        <w:rPr>
+          <w:b/>
+          <w:bCs/>
+        </w:rPr>
+        <w:t>, 5);</w:t>
+      </w:r>
+      <w:r>
+        <w:rPr>
+          <w:b/>
+          <w:bCs/>
+        </w:rPr>
+        <w:t xml:space="preserve"> </w:t>
+      </w:r>
+      <w:r>
+        <w:t xml:space="preserve">and </w:t>
+      </w:r>
+      <w:proofErr w:type="spellStart"/>
+      <w:r>
+        <w:rPr>
+          <w:b/>
+          <w:bCs/>
+        </w:rPr>
+        <w:t>label.setBorder</w:t>
+      </w:r>
+      <w:proofErr w:type="spellEnd"/>
+      <w:r>
+        <w:rPr>
+          <w:b/>
+          <w:bCs/>
+        </w:rPr>
+        <w:t>(border);</w:t>
+      </w:r>
+    </w:p>
+    <w:p>
+      <w:pPr>
+        <w:pStyle w:val="NoSpacing"/>
+      </w:pPr>
+      <w:r>
+        <w:t>To change where the text and image is placed within the label</w:t>
+      </w:r>
+      <w:r>
+        <w:t xml:space="preserve"> (if using a Border Layout manager)</w:t>
+      </w:r>
+      <w:r>
+        <w:t xml:space="preserve">, you use </w:t>
+      </w:r>
+      <w:proofErr w:type="spellStart"/>
+      <w:r>
+        <w:rPr>
+          <w:b/>
+          <w:bCs/>
+        </w:rPr>
+        <w:t>label.setVerticalAlignment</w:t>
+      </w:r>
+      <w:proofErr w:type="spellEnd"/>
+      <w:r>
+        <w:rPr>
+          <w:b/>
+          <w:bCs/>
+        </w:rPr>
+        <w:t>(</w:t>
+      </w:r>
+      <w:proofErr w:type="spellStart"/>
+      <w:r>
+        <w:rPr>
+          <w:b/>
+          <w:bCs/>
+        </w:rPr>
+        <w:t>JLabel.TOP</w:t>
+      </w:r>
+      <w:proofErr w:type="spellEnd"/>
+      <w:r>
+        <w:rPr>
+          <w:b/>
+          <w:bCs/>
+        </w:rPr>
+        <w:t>);</w:t>
+      </w:r>
+      <w:r>
+        <w:rPr>
+          <w:b/>
+          <w:bCs/>
+        </w:rPr>
+        <w:t xml:space="preserve"> </w:t>
+      </w:r>
+      <w:r>
+        <w:t xml:space="preserve">for vertical position, and </w:t>
+      </w:r>
+      <w:proofErr w:type="spellStart"/>
+      <w:r>
+        <w:rPr>
+          <w:b/>
+          <w:bCs/>
+        </w:rPr>
+        <w:t>label.setHorizontalAlignment</w:t>
+      </w:r>
+      <w:proofErr w:type="spellEnd"/>
+      <w:r>
+        <w:rPr>
+          <w:b/>
+          <w:bCs/>
+        </w:rPr>
+        <w:t>(</w:t>
+      </w:r>
+      <w:proofErr w:type="spellStart"/>
+      <w:r>
+        <w:rPr>
+          <w:b/>
+          <w:bCs/>
+        </w:rPr>
+        <w:t>JLabel.</w:t>
+      </w:r>
+      <w:r>
+        <w:rPr>
+          <w:b/>
+          <w:bCs/>
+          <w:i/>
+          <w:iCs/>
+        </w:rPr>
+        <w:t>CENTER</w:t>
+      </w:r>
+      <w:proofErr w:type="spellEnd"/>
+      <w:r>
+        <w:rPr>
+          <w:b/>
+          <w:bCs/>
+        </w:rPr>
+        <w:t>);</w:t>
+      </w:r>
+      <w:r>
+        <w:rPr>
+          <w:b/>
+          <w:bCs/>
+        </w:rPr>
+        <w:t xml:space="preserve"> </w:t>
+      </w:r>
+      <w:r>
+        <w:t>for horizontal position.</w:t>
+      </w:r>
+    </w:p>
+    <w:p>
+      <w:pPr>
+        <w:pStyle w:val="NoSpacing"/>
+      </w:pPr>
+      <w:r>
+        <w:t xml:space="preserve">To position the label within the frame so it does not take up the whole frame, you can use </w:t>
+      </w:r>
+      <w:proofErr w:type="spellStart"/>
+      <w:r>
+        <w:rPr>
+          <w:b/>
+          <w:bCs/>
+        </w:rPr>
+        <w:t>frame.setLayout</w:t>
+      </w:r>
+      <w:proofErr w:type="spellEnd"/>
+      <w:r>
+        <w:rPr>
+          <w:b/>
+          <w:bCs/>
+        </w:rPr>
+        <w:t>(null);</w:t>
+      </w:r>
+      <w:r>
+        <w:t xml:space="preserve"> followed by </w:t>
+      </w:r>
+      <w:proofErr w:type="spellStart"/>
+      <w:r>
+        <w:rPr>
+          <w:b/>
+          <w:bCs/>
+        </w:rPr>
+        <w:t>label.setBounds</w:t>
+      </w:r>
+      <w:proofErr w:type="spellEnd"/>
+      <w:r>
+        <w:rPr>
+          <w:b/>
+          <w:bCs/>
+        </w:rPr>
+        <w:t>(0,0,250,250)</w:t>
+      </w:r>
+      <w:r>
+        <w:t>; where the first two numbers are the coordinates of the top right of the label, and the next two numbers are the dimensions of the label.</w:t>
+      </w:r>
+    </w:p>
+    <w:p>
+      <w:pPr>
+        <w:pStyle w:val="NoSpacing"/>
+      </w:pPr>
+      <w:r>
+        <w:t xml:space="preserve">To make the frame adjust to fit all the components that you have, you can use the default layout manager and </w:t>
+      </w:r>
+      <w:proofErr w:type="spellStart"/>
+      <w:r>
+        <w:rPr>
+          <w:b/>
+          <w:bCs/>
+        </w:rPr>
+        <w:t>frame.pack</w:t>
+      </w:r>
+      <w:proofErr w:type="spellEnd"/>
+      <w:r>
+        <w:rPr>
+          <w:b/>
+          <w:bCs/>
+        </w:rPr>
+        <w:t>();</w:t>
+      </w:r>
+      <w:r>
+        <w:rPr>
+          <w:b/>
+          <w:bCs/>
+        </w:rPr>
+        <w:t xml:space="preserve"> </w:t>
+      </w:r>
+      <w:r>
+        <w:t>(must be at end of code)</w:t>
+      </w:r>
+    </w:p>
+    <w:p>
+      <w:pPr>
+        <w:pStyle w:val="NoSpacing"/>
+      </w:pPr>
+    </w:p>
+    <w:p>
+      <w:pPr>
+        <w:pStyle w:val="NoSpacing"/>
+        <w:rPr>
+          <w:b/>
+          <w:bCs/>
+          <w:sz w:val="32"/>
+          <w:szCs w:val="32"/>
+          <w:u w:val="single"/>
+        </w:rPr>
+      </w:pPr>
+      <w:proofErr w:type="spellStart"/>
+      <w:r>
+        <w:rPr>
+          <w:b/>
+          <w:bCs/>
+          <w:sz w:val="32"/>
+          <w:szCs w:val="32"/>
+          <w:u w:val="single"/>
+        </w:rPr>
+        <w:t>JPanels</w:t>
+      </w:r>
+      <w:proofErr w:type="spellEnd"/>
+    </w:p>
+    <w:p>
+      <w:pPr>
+        <w:pStyle w:val="NoSpacing"/>
+        <w:rPr>
+          <w:b/>
+          <w:bCs/>
+        </w:rPr>
+      </w:pPr>
+      <w:r>
+        <w:t xml:space="preserve">To create a </w:t>
+      </w:r>
+      <w:proofErr w:type="spellStart"/>
+      <w:r>
+        <w:t>JPanel</w:t>
+      </w:r>
+      <w:proofErr w:type="spellEnd"/>
+      <w:r>
+        <w:t xml:space="preserve"> (a smaller container within the </w:t>
+      </w:r>
+      <w:proofErr w:type="spellStart"/>
+      <w:r>
+        <w:t>JFrame</w:t>
+      </w:r>
+      <w:proofErr w:type="spellEnd"/>
+      <w:r>
+        <w:t>)</w:t>
+      </w:r>
+      <w:r>
+        <w:t xml:space="preserve">, you use </w:t>
+      </w:r>
+      <w:proofErr w:type="spellStart"/>
+      <w:r>
+        <w:rPr>
+          <w:b/>
+          <w:bCs/>
+        </w:rPr>
+        <w:t>JPanel</w:t>
+      </w:r>
+      <w:proofErr w:type="spellEnd"/>
+      <w:r>
+        <w:rPr>
+          <w:b/>
+          <w:bCs/>
+        </w:rPr>
+        <w:t xml:space="preserve"> </w:t>
+      </w:r>
+      <w:proofErr w:type="spellStart"/>
+      <w:r>
+        <w:rPr>
+          <w:b/>
+          <w:bCs/>
+        </w:rPr>
+        <w:t>redPanel</w:t>
+      </w:r>
+      <w:proofErr w:type="spellEnd"/>
+      <w:r>
+        <w:rPr>
+          <w:b/>
+          <w:bCs/>
+        </w:rPr>
+        <w:t xml:space="preserve"> = new </w:t>
+      </w:r>
+      <w:proofErr w:type="spellStart"/>
+      <w:r>
+        <w:rPr>
+          <w:b/>
+          <w:bCs/>
+        </w:rPr>
+        <w:t>JPanel</w:t>
+      </w:r>
+      <w:proofErr w:type="spellEnd"/>
+      <w:r>
+        <w:rPr>
+          <w:b/>
+          <w:bCs/>
+        </w:rPr>
+        <w:t xml:space="preserve">(); </w:t>
+      </w:r>
+      <w:r>
+        <w:t>and</w:t>
+      </w:r>
+      <w:r>
+        <w:rPr>
+          <w:b/>
+          <w:bCs/>
+        </w:rPr>
+        <w:t xml:space="preserve"> import </w:t>
+      </w:r>
+      <w:proofErr w:type="spellStart"/>
+      <w:r>
+        <w:rPr>
+          <w:b/>
+          <w:bCs/>
+        </w:rPr>
+        <w:t>javax.swing.JPanel</w:t>
+      </w:r>
+      <w:proofErr w:type="spellEnd"/>
+      <w:r>
+        <w:rPr>
+          <w:b/>
+          <w:bCs/>
+        </w:rPr>
+        <w:t>;</w:t>
+      </w:r>
+    </w:p>
+    <w:p>
+      <w:pPr>
+        <w:pStyle w:val="NoSpacing"/>
+      </w:pPr>
+      <w:r>
+        <w:t xml:space="preserve">You can then set the bounds of the panel using the same method as above. </w:t>
+      </w:r>
+    </w:p>
+    <w:p>
+      <w:pPr>
+        <w:pStyle w:val="NoSpacing"/>
+        <w:rPr>
+          <w:b/>
+          <w:bCs/>
+        </w:rPr>
+      </w:pPr>
+      <w:r>
+        <w:t xml:space="preserve">Then you need to add the </w:t>
+      </w:r>
+      <w:proofErr w:type="spellStart"/>
+      <w:r>
+        <w:t>JPanel</w:t>
+      </w:r>
+      <w:proofErr w:type="spellEnd"/>
+      <w:r>
+        <w:t xml:space="preserve"> to the </w:t>
+      </w:r>
+      <w:proofErr w:type="spellStart"/>
+      <w:r>
+        <w:t>JFrame</w:t>
+      </w:r>
+      <w:proofErr w:type="spellEnd"/>
+      <w:r>
+        <w:t xml:space="preserve"> using </w:t>
+      </w:r>
+      <w:proofErr w:type="spellStart"/>
+      <w:r>
+        <w:rPr>
+          <w:b/>
+          <w:bCs/>
+        </w:rPr>
+        <w:t>frame.add</w:t>
+      </w:r>
+      <w:proofErr w:type="spellEnd"/>
+      <w:r>
+        <w:rPr>
+          <w:b/>
+          <w:bCs/>
+        </w:rPr>
+        <w:t>(</w:t>
+      </w:r>
+      <w:proofErr w:type="spellStart"/>
+      <w:r>
+        <w:rPr>
+          <w:b/>
+          <w:bCs/>
+        </w:rPr>
+        <w:t>redPanel</w:t>
+      </w:r>
+      <w:proofErr w:type="spellEnd"/>
+      <w:r>
+        <w:rPr>
+          <w:b/>
+          <w:bCs/>
+        </w:rPr>
+        <w:t>);</w:t>
+      </w:r>
+    </w:p>
+    <w:p>
+      <w:pPr>
+        <w:pStyle w:val="NoSpacing"/>
+      </w:pPr>
+      <w:r>
+        <w:t xml:space="preserve">To add a label to the panel, you use </w:t>
+      </w:r>
+      <w:proofErr w:type="spellStart"/>
+      <w:r>
+        <w:t>panel.add</w:t>
+      </w:r>
+      <w:proofErr w:type="spellEnd"/>
+      <w:r>
+        <w:t>(label);</w:t>
+      </w:r>
+    </w:p>
+    <w:p>
+      <w:pPr>
+        <w:pStyle w:val="NoSpacing"/>
+        <w:rPr>
+          <w:b/>
+          <w:bCs/>
+        </w:rPr>
+      </w:pPr>
+      <w:r>
+        <w:t xml:space="preserve">To make the layout manager a border layout like before, you can use </w:t>
+      </w:r>
+      <w:proofErr w:type="spellStart"/>
+      <w:r>
+        <w:rPr>
+          <w:b/>
+          <w:bCs/>
+        </w:rPr>
+        <w:t>redPanel.setLayout</w:t>
+      </w:r>
+      <w:proofErr w:type="spellEnd"/>
+      <w:r>
+        <w:rPr>
+          <w:b/>
+          <w:bCs/>
+        </w:rPr>
+        <w:t xml:space="preserve">(new </w:t>
+      </w:r>
+      <w:proofErr w:type="spellStart"/>
+      <w:r>
+        <w:rPr>
+          <w:b/>
+          <w:bCs/>
+        </w:rPr>
+        <w:t>BorderLayout</w:t>
+      </w:r>
+      <w:proofErr w:type="spellEnd"/>
+      <w:r>
+        <w:rPr>
+          <w:b/>
+          <w:bCs/>
+        </w:rPr>
+        <w:t xml:space="preserve">()); </w:t>
+      </w:r>
+      <w:r>
+        <w:t>and</w:t>
+      </w:r>
+      <w:r>
+        <w:rPr>
+          <w:b/>
+          <w:bCs/>
+        </w:rPr>
+        <w:t xml:space="preserve"> import </w:t>
+      </w:r>
+      <w:proofErr w:type="spellStart"/>
+      <w:r>
+        <w:rPr>
+          <w:b/>
+          <w:bCs/>
+        </w:rPr>
+        <w:t>java.awt.BorderLayout</w:t>
+      </w:r>
+      <w:proofErr w:type="spellEnd"/>
+      <w:r>
+        <w:rPr>
+          <w:b/>
+          <w:bCs/>
+        </w:rPr>
+        <w:t>;</w:t>
+      </w:r>
+    </w:p>
+    <w:p>
+      <w:pPr>
+        <w:pStyle w:val="NoSpacing"/>
+      </w:pPr>
+    </w:p>
+    <w:p>
+      <w:pPr>
+        <w:pStyle w:val="NoSpacing"/>
+        <w:rPr>
+          <w:b/>
+          <w:bCs/>
+          <w:sz w:val="28"/>
+          <w:szCs w:val="28"/>
+          <w:u w:val="single"/>
+        </w:rPr>
+      </w:pPr>
+      <w:r>
+        <w:rPr>
+          <w:b/>
+          <w:bCs/>
+          <w:sz w:val="28"/>
+          <w:szCs w:val="28"/>
+          <w:u w:val="single"/>
+        </w:rPr>
+        <w:t>Buttons</w:t>
+      </w:r>
+    </w:p>
+    <w:p>
+      <w:pPr>
+        <w:pStyle w:val="NoSpacing"/>
+      </w:pPr>
+      <w:r>
+        <w:t xml:space="preserve">To create a button, you use </w:t>
+      </w:r>
+      <w:proofErr w:type="spellStart"/>
+      <w:r>
+        <w:rPr>
+          <w:b/>
+          <w:bCs/>
+        </w:rPr>
+        <w:t>JButton</w:t>
+      </w:r>
+      <w:proofErr w:type="spellEnd"/>
+      <w:r>
+        <w:rPr>
+          <w:b/>
+          <w:bCs/>
+        </w:rPr>
+        <w:t xml:space="preserve"> button = new </w:t>
+      </w:r>
+      <w:proofErr w:type="spellStart"/>
+      <w:r>
+        <w:rPr>
+          <w:b/>
+          <w:bCs/>
+        </w:rPr>
+        <w:t>JButton</w:t>
+      </w:r>
+      <w:proofErr w:type="spellEnd"/>
+      <w:r>
+        <w:rPr>
+          <w:b/>
+          <w:bCs/>
+        </w:rPr>
+        <w:t xml:space="preserve">(); </w:t>
+      </w:r>
+      <w:r>
+        <w:t>and</w:t>
+      </w:r>
+      <w:r>
+        <w:rPr>
+          <w:b/>
+          <w:bCs/>
+        </w:rPr>
+        <w:t xml:space="preserve"> import </w:t>
+      </w:r>
+      <w:proofErr w:type="spellStart"/>
+      <w:r>
+        <w:rPr>
+          <w:b/>
+          <w:bCs/>
+        </w:rPr>
+        <w:t>javax.swing.JButton</w:t>
+      </w:r>
+      <w:proofErr w:type="spellEnd"/>
+      <w:r>
+        <w:rPr>
+          <w:b/>
+          <w:bCs/>
+        </w:rPr>
+        <w:t>;</w:t>
+      </w:r>
+      <w:r>
+        <w:rPr>
+          <w:b/>
+          <w:bCs/>
+        </w:rPr>
+        <w:t xml:space="preserve"> </w:t>
+      </w:r>
+      <w:r>
+        <w:t>(should declare the button outside of the constructor so it is global so that it can be used for the action listener when trying to add functionality to it).</w:t>
+      </w:r>
+    </w:p>
+    <w:p>
+      <w:pPr>
+        <w:pStyle w:val="NoSpacing"/>
+      </w:pPr>
+      <w:r>
+        <w:t xml:space="preserve">You then need to use </w:t>
+      </w:r>
+      <w:proofErr w:type="spellStart"/>
+      <w:r>
+        <w:rPr>
+          <w:b/>
+          <w:bCs/>
+        </w:rPr>
+        <w:t>this.add</w:t>
+      </w:r>
+      <w:proofErr w:type="spellEnd"/>
+      <w:r>
+        <w:rPr>
+          <w:b/>
+          <w:bCs/>
+        </w:rPr>
+        <w:t>(button);</w:t>
+      </w:r>
+      <w:r>
+        <w:t xml:space="preserve"> (as am doing this inside the constructor of </w:t>
+      </w:r>
+      <w:proofErr w:type="spellStart"/>
+      <w:r>
+        <w:t>MyFrame</w:t>
+      </w:r>
+      <w:proofErr w:type="spellEnd"/>
+      <w:r>
+        <w:t>)</w:t>
+      </w:r>
+    </w:p>
+    <w:p>
+      <w:pPr>
+        <w:pStyle w:val="NoSpacing"/>
+      </w:pPr>
+      <w:r>
+        <w:t>Then to make the button do something when pressed, you change the class to:</w:t>
+      </w:r>
+    </w:p>
+    <w:p>
+      <w:pPr>
+        <w:pStyle w:val="NoSpacing"/>
+        <w:rPr>
+          <w:b/>
+          <w:bCs/>
+        </w:rPr>
+      </w:pPr>
+      <w:r>
+        <w:rPr>
+          <w:b/>
+          <w:bCs/>
+        </w:rPr>
+        <w:t xml:space="preserve">Public class </w:t>
+      </w:r>
+      <w:proofErr w:type="spellStart"/>
+      <w:r>
+        <w:rPr>
+          <w:b/>
+          <w:bCs/>
+        </w:rPr>
+        <w:t>MyFrame</w:t>
+      </w:r>
+      <w:proofErr w:type="spellEnd"/>
+      <w:r>
+        <w:rPr>
+          <w:b/>
+          <w:bCs/>
+        </w:rPr>
+        <w:t xml:space="preserve"> extends </w:t>
+      </w:r>
+      <w:proofErr w:type="spellStart"/>
+      <w:r>
+        <w:rPr>
+          <w:b/>
+          <w:bCs/>
+        </w:rPr>
+        <w:t>JFrame</w:t>
+      </w:r>
+      <w:proofErr w:type="spellEnd"/>
+      <w:r>
+        <w:rPr>
+          <w:b/>
+          <w:bCs/>
+        </w:rPr>
+        <w:t xml:space="preserve"> implements ActionListener{</w:t>
+      </w:r>
+    </w:p>
+    <w:p>
+      <w:pPr>
+        <w:pStyle w:val="NoSpacing"/>
+        <w:rPr>
+          <w:b/>
+          <w:bCs/>
+        </w:rPr>
+      </w:pPr>
+      <w:r>
+        <w:rPr>
+          <w:b/>
+          <w:bCs/>
+        </w:rPr>
+        <w:t>}</w:t>
+      </w:r>
+    </w:p>
+    <w:p>
+      <w:pPr>
+        <w:pStyle w:val="NoSpacing"/>
+        <w:rPr>
+          <w:b/>
+          <w:bCs/>
+        </w:rPr>
+      </w:pPr>
+      <w:r>
+        <w:t xml:space="preserve">And </w:t>
+      </w:r>
+      <w:r>
+        <w:rPr>
+          <w:b/>
+          <w:bCs/>
+        </w:rPr>
+        <w:t xml:space="preserve">import </w:t>
+      </w:r>
+      <w:proofErr w:type="spellStart"/>
+      <w:r>
+        <w:rPr>
+          <w:b/>
+          <w:bCs/>
+        </w:rPr>
+        <w:t>java.awt.event.ActionListener</w:t>
+      </w:r>
+      <w:proofErr w:type="spellEnd"/>
+      <w:r>
+        <w:rPr>
+          <w:b/>
+          <w:bCs/>
+        </w:rPr>
+        <w:t>;</w:t>
+      </w:r>
+    </w:p>
+    <w:p>
+      <w:pPr>
+        <w:pStyle w:val="NoSpacing"/>
+      </w:pPr>
+      <w:r>
+        <w:t xml:space="preserve">And then to add </w:t>
+      </w:r>
+      <w:proofErr w:type="spellStart"/>
+      <w:r>
+        <w:t>functionalily</w:t>
+      </w:r>
+      <w:proofErr w:type="spellEnd"/>
+      <w:r>
+        <w:t>, you write:</w:t>
+      </w:r>
+    </w:p>
+    <w:p>
+      <w:pPr>
+        <w:pStyle w:val="NoSpacing"/>
+        <w:rPr>
+          <w:b/>
+          <w:bCs/>
+        </w:rPr>
+      </w:pPr>
+      <w:r>
+        <w:rPr>
+          <w:b/>
+          <w:bCs/>
+        </w:rPr>
+        <w:t>@Override</w:t>
+      </w:r>
+      <w:r>
+        <w:rPr>
+          <w:b/>
+          <w:bCs/>
+        </w:rPr>
+        <w:br/>
+        <w:t xml:space="preserve">public void </w:t>
+      </w:r>
+      <w:proofErr w:type="spellStart"/>
+      <w:r>
+        <w:rPr>
+          <w:b/>
+          <w:bCs/>
+        </w:rPr>
+        <w:t>actionPerformed</w:t>
+      </w:r>
+      <w:proofErr w:type="spellEnd"/>
+      <w:r>
+        <w:rPr>
+          <w:b/>
+          <w:bCs/>
+        </w:rPr>
+        <w:t>(</w:t>
+      </w:r>
+      <w:proofErr w:type="spellStart"/>
+      <w:r>
+        <w:rPr>
+          <w:b/>
+          <w:bCs/>
+        </w:rPr>
+        <w:t>ActionEvent</w:t>
+      </w:r>
+      <w:proofErr w:type="spellEnd"/>
+      <w:r>
+        <w:rPr>
+          <w:b/>
+          <w:bCs/>
+        </w:rPr>
+        <w:t xml:space="preserve"> e){</w:t>
+      </w:r>
+      <w:r>
+        <w:rPr>
+          <w:b/>
+          <w:bCs/>
+        </w:rPr>
+        <w:br/>
+        <w:t xml:space="preserve">    if(</w:t>
+      </w:r>
+      <w:proofErr w:type="spellStart"/>
+      <w:r>
+        <w:rPr>
+          <w:b/>
+          <w:bCs/>
+        </w:rPr>
+        <w:t>e.getSource</w:t>
+      </w:r>
+      <w:proofErr w:type="spellEnd"/>
+      <w:r>
+        <w:rPr>
+          <w:b/>
+          <w:bCs/>
+        </w:rPr>
+        <w:t>()==button){</w:t>
+      </w:r>
+      <w:r>
+        <w:rPr>
+          <w:b/>
+          <w:bCs/>
+        </w:rPr>
+        <w:br/>
+        <w:t xml:space="preserve">        </w:t>
+      </w:r>
+      <w:proofErr w:type="spellStart"/>
+      <w:r>
+        <w:rPr>
+          <w:b/>
+          <w:bCs/>
+        </w:rPr>
+        <w:t>System.</w:t>
+      </w:r>
+      <w:r>
+        <w:rPr>
+          <w:b/>
+          <w:bCs/>
+          <w:i/>
+          <w:iCs/>
+        </w:rPr>
+        <w:t>out</w:t>
+      </w:r>
+      <w:r>
+        <w:rPr>
+          <w:b/>
+          <w:bCs/>
+        </w:rPr>
+        <w:t>.println</w:t>
+      </w:r>
+      <w:proofErr w:type="spellEnd"/>
+      <w:r>
+        <w:rPr>
+          <w:b/>
+          <w:bCs/>
+        </w:rPr>
+        <w:t>("hello there");</w:t>
+      </w:r>
+      <w:r>
+        <w:rPr>
+          <w:b/>
+          <w:bCs/>
+        </w:rPr>
+        <w:br/>
+        <w:t xml:space="preserve">    }</w:t>
+      </w:r>
+      <w:r>
+        <w:rPr>
+          <w:b/>
+          <w:bCs/>
+        </w:rPr>
+        <w:br/>
+        <w:t>}</w:t>
+      </w:r>
+    </w:p>
+    <w:p>
+      <w:pPr>
+        <w:pStyle w:val="NoSpacing"/>
+        <w:rPr>
+          <w:b/>
+          <w:bCs/>
+        </w:rPr>
+      </w:pPr>
+      <w:r>
+        <w:t xml:space="preserve">And </w:t>
+      </w:r>
+      <w:r>
+        <w:rPr>
+          <w:b/>
+          <w:bCs/>
+        </w:rPr>
+        <w:t xml:space="preserve">import </w:t>
+      </w:r>
+      <w:proofErr w:type="spellStart"/>
+      <w:r>
+        <w:rPr>
+          <w:b/>
+          <w:bCs/>
+        </w:rPr>
+        <w:t>java.awt.event.ActionEvent</w:t>
+      </w:r>
+      <w:proofErr w:type="spellEnd"/>
+      <w:r>
+        <w:rPr>
+          <w:b/>
+          <w:bCs/>
+        </w:rPr>
+        <w:t>;</w:t>
+      </w:r>
+    </w:p>
+    <w:p>
+      <w:pPr>
+        <w:pStyle w:val="NoSpacing"/>
+      </w:pPr>
+      <w:r>
+        <w:t xml:space="preserve">Then you must write </w:t>
+      </w:r>
+      <w:proofErr w:type="spellStart"/>
+      <w:r>
+        <w:rPr>
+          <w:b/>
+          <w:bCs/>
+        </w:rPr>
+        <w:t>button.addActionListener</w:t>
+      </w:r>
+      <w:proofErr w:type="spellEnd"/>
+      <w:r>
+        <w:rPr>
+          <w:b/>
+          <w:bCs/>
+        </w:rPr>
+        <w:t xml:space="preserve">(this); </w:t>
+      </w:r>
+      <w:r>
+        <w:t>inside the constructor</w:t>
+      </w:r>
+    </w:p>
+    <w:p>
+      <w:pPr>
+        <w:pStyle w:val="NoSpacing"/>
+        <w:rPr>
+          <w:b/>
+          <w:bCs/>
+        </w:rPr>
+      </w:pPr>
+      <w:r>
+        <w:t xml:space="preserve">To add text to the button, you can use </w:t>
+      </w:r>
+      <w:proofErr w:type="spellStart"/>
+      <w:r>
+        <w:rPr>
+          <w:b/>
+          <w:bCs/>
+        </w:rPr>
+        <w:t>button.setText</w:t>
+      </w:r>
+      <w:proofErr w:type="spellEnd"/>
+      <w:r>
+        <w:rPr>
+          <w:b/>
+          <w:bCs/>
+        </w:rPr>
+        <w:t>(“I am a button!”);</w:t>
+      </w:r>
+    </w:p>
+    <w:p>
+      <w:pPr>
+        <w:pStyle w:val="NoSpacing"/>
+      </w:pPr>
+      <w:r>
+        <w:t xml:space="preserve">To remove the box around the text, you can use </w:t>
+      </w:r>
+      <w:proofErr w:type="spellStart"/>
+      <w:r>
+        <w:rPr>
+          <w:b/>
+          <w:bCs/>
+        </w:rPr>
+        <w:t>button.setFocusable</w:t>
+      </w:r>
+      <w:proofErr w:type="spellEnd"/>
+      <w:r>
+        <w:rPr>
+          <w:b/>
+          <w:bCs/>
+        </w:rPr>
+        <w:t>(false);</w:t>
+      </w:r>
+    </w:p>
+    <w:p>
+      <w:pPr>
+        <w:pStyle w:val="NoSpacing"/>
+        <w:rPr>
+          <w:b/>
+          <w:bCs/>
+        </w:rPr>
+      </w:pPr>
+      <w:r>
+        <w:t xml:space="preserve">To set the image icon of the button, you can use </w:t>
+      </w:r>
+      <w:proofErr w:type="spellStart"/>
+      <w:r>
+        <w:rPr>
+          <w:b/>
+          <w:bCs/>
+        </w:rPr>
+        <w:t>button.setIcon</w:t>
+      </w:r>
+      <w:proofErr w:type="spellEnd"/>
+      <w:r>
+        <w:rPr>
+          <w:b/>
+          <w:bCs/>
+        </w:rPr>
+        <w:t>(icon);</w:t>
+      </w:r>
+    </w:p>
+    <w:p>
+      <w:pPr>
+        <w:pStyle w:val="NoSpacing"/>
+      </w:pPr>
+      <w:r>
+        <w:t>You can format the button text and background / foreground in the exact same way as for the label, just use “button.” Instead of “label.”.</w:t>
+      </w:r>
+    </w:p>
+    <w:p>
+      <w:pPr>
+        <w:pStyle w:val="NoSpacing"/>
+      </w:pPr>
+      <w:r>
+        <w:lastRenderedPageBreak/>
+        <w:t xml:space="preserve">To set the border of the button, use </w:t>
+      </w:r>
+      <w:proofErr w:type="spellStart"/>
+      <w:r>
+        <w:rPr>
+          <w:b/>
+          <w:bCs/>
+        </w:rPr>
+        <w:t>button.setBorder</w:t>
+      </w:r>
+      <w:proofErr w:type="spellEnd"/>
+      <w:r>
+        <w:rPr>
+          <w:b/>
+          <w:bCs/>
+        </w:rPr>
+        <w:t>(border);</w:t>
+      </w:r>
+      <w:r>
+        <w:t xml:space="preserve"> just like before</w:t>
+      </w:r>
+    </w:p>
+    <w:p>
+      <w:pPr>
+        <w:pStyle w:val="NoSpacing"/>
+        <w:rPr>
+          <w:b/>
+          <w:bCs/>
+        </w:rPr>
+      </w:pPr>
+      <w:r>
+        <w:t>To disable the button, you can use</w:t>
+      </w:r>
+      <w:r>
+        <w:rPr>
+          <w:b/>
+          <w:bCs/>
+        </w:rPr>
+        <w:t xml:space="preserve"> </w:t>
+      </w:r>
+      <w:proofErr w:type="spellStart"/>
+      <w:r>
+        <w:rPr>
+          <w:b/>
+          <w:bCs/>
+        </w:rPr>
+        <w:t>button.setEnabled</w:t>
+      </w:r>
+      <w:proofErr w:type="spellEnd"/>
+      <w:r>
+        <w:rPr>
+          <w:b/>
+          <w:bCs/>
+        </w:rPr>
+        <w:t>(false);</w:t>
+      </w:r>
+    </w:p>
+    <w:p>
+      <w:pPr>
+        <w:pStyle w:val="NoSpacing"/>
+      </w:pPr>
+    </w:p>
+    <w:p>
+      <w:pPr>
+        <w:pStyle w:val="NoSpacing"/>
+        <w:rPr>
+          <w:b/>
+          <w:bCs/>
+          <w:sz w:val="32"/>
+          <w:szCs w:val="32"/>
+          <w:u w:val="single"/>
+        </w:rPr>
+      </w:pPr>
+      <w:r>
+        <w:rPr>
+          <w:b/>
+          <w:bCs/>
+          <w:sz w:val="32"/>
+          <w:szCs w:val="32"/>
+          <w:u w:val="single"/>
+        </w:rPr>
+        <w:t>Border Layout Managers</w:t>
       </w:r>
     </w:p>
     <w:p>
@@ -1703,6 +4296,36 @@
       <w:spacing w:after="0" w:line="240" w:lineRule="auto"/>
     </w:pPr>
   </w:style>
+  <w:style w:type="paragraph" w:styleId="HTMLPreformatted">
+    <w:name w:val="HTML Preformatted"/>
+    <w:basedOn w:val="Normal"/>
+    <w:link w:val="HTMLPreformattedChar"/>
+    <w:uiPriority w:val="99"/>
+    <w:semiHidden/>
+    <w:unhideWhenUsed/>
+    <w:rsid w:val="00CE1CFC"/>
+    <w:pPr>
+      <w:spacing w:after="0" w:line="240" w:lineRule="auto"/>
+    </w:pPr>
+    <w:rPr>
+      <w:rFonts w:ascii="Consolas" w:hAnsi="Consolas"/>
+      <w:sz w:val="20"/>
+      <w:szCs w:val="20"/>
+    </w:rPr>
+  </w:style>
+  <w:style w:type="character" w:customStyle="1" w:styleId="HTMLPreformattedChar">
+    <w:name w:val="HTML Preformatted Char"/>
+    <w:basedOn w:val="DefaultParagraphFont"/>
+    <w:link w:val="HTMLPreformatted"/>
+    <w:uiPriority w:val="99"/>
+    <w:semiHidden/>
+    <w:rsid w:val="00CE1CFC"/>
+    <w:rPr>
+      <w:rFonts w:ascii="Consolas" w:hAnsi="Consolas"/>
+      <w:sz w:val="20"/>
+      <w:szCs w:val="20"/>
+    </w:rPr>
+  </w:style>
 </w:styles>
 </file>
 

</xml_diff>